<commit_message>
feat: docx skill 추가
</commit_message>
<xml_diff>
--- a/output.docx
+++ b/output.docx
@@ -12,33 +12,102 @@
     </w:p>
     <w:p>
       <w:pPr>
-        <w:pStyle w:val="Heading2"/>
+        <w:jc w:val="center"/>
+        <w:spacing w:before="240" w:after="120"/>
       </w:pPr>
       <w:r>
+        <w:rPr>
+          <w:b/>
+          <w:rFonts w:eastAsia="맑은 고딕" w:ascii="맑은 고딕" w:hAnsi="맑은 고딕"/>
+          <w:sz w:val="32"/>
+          <w:color w:val="003899"/>
+        </w:rPr>
+        <w:t>목차</w:t>
+      </w:r>
+    </w:p>
+    <w:p>
+      <w:r>
+        <w:fldChar w:fldCharType="begin"/>
+        <w:instrText xml:space="preserve">TOC \o "1-3" \h \z \u</w:instrText>
+        <w:fldChar w:fldCharType="separate"/>
+        <w:fldChar w:fldCharType="end"/>
+      </w:r>
+    </w:p>
+    <w:p/>
+    <w:p>
+      <w:pPr>
+        <w:pStyle w:val="Heading2"/>
+        <w:spacing w:before="360" w:after="160"/>
+      </w:pPr>
+      <w:r>
+        <w:rPr>
+          <w:rFonts w:ascii="맑은 고딕" w:hAnsi="맑은 고딕" w:eastAsia="맑은 고딕"/>
+          <w:b/>
+          <w:color w:val="003899"/>
+          <w:sz w:val="32"/>
+        </w:rPr>
         <w:t>서론</w:t>
       </w:r>
     </w:p>
     <w:p>
+      <w:pPr>
+        <w:spacing w:line="360" w:lineRule="auto" w:after="160"/>
+      </w:pPr>
       <w:r>
-        <w:t>본 보고서는 회사의 기술 역량과 시장 내 차별화 전략을 종합적으로 정리한 문서입니다. 2024년 주요 프로젝트 성과와 향후 발전 방향을 함께 다루고 있습니다.</w:t>
+        <w:rPr>
+          <w:rFonts w:ascii="맑은 고딕" w:hAnsi="맑은 고딕" w:eastAsia="맑은 고딕"/>
+          <w:color w:val="3C3C3C"/>
+          <w:sz w:val="22"/>
+        </w:rPr>
+        <w:t>AI 기반 문서 자동화 기술은 현재 비즈니스 환경에서 필수불가결한 도구로 자리 잡고 있습니다. 이 기술은 효율성과 생산성을 높이는 동시에 사람의 시간과 노력을 절약하는데 중점을 두고 있습니다. 특히, AI는 반복적인 문서 작업을 자동화하여 업무 프로세스를 단순화하고, 인간의 에러를 줄이며, 일관된 품질을 유지하는 데 도움을 주는데 큰 역할을 합니다. 또한, 이 기술은 다양한 산업 분야에서 활용되어 문서 생성부터 검토, 결제 과정까지 자동화를 통해 비즈니스 프로세스의 효율성을 극대화하고 있습니다.</w:t>
       </w:r>
     </w:p>
     <w:p>
       <w:pPr>
         <w:pStyle w:val="Heading2"/>
+        <w:spacing w:before="360" w:after="160"/>
       </w:pPr>
       <w:r>
-        <w:t>회사 기술 역량</w:t>
+        <w:rPr>
+          <w:rFonts w:ascii="맑은 고딕" w:hAnsi="맑은 고딕" w:eastAsia="맑은 고딕"/>
+          <w:b/>
+          <w:color w:val="003899"/>
+          <w:sz w:val="32"/>
+        </w:rPr>
+        <w:t>기술 개요</w:t>
       </w:r>
     </w:p>
     <w:p>
+      <w:pPr>
+        <w:spacing w:line="360" w:lineRule="auto" w:after="160"/>
+      </w:pPr>
       <w:r>
-        <w:t>회사의 주요 기술 역량은 AWS Bedrock, LangGraph, RAG(OpenSearch), Isolation Forest, Z-score 등 다양한 알고리즘과 클라우드 기반 기술을 활용하는 능력입니다. 프로젝트 경험으로는, 관세 문서 자동화를 위한 시스템 구축에서 python-docx 라이브러리를 활용한 템플릿 필러 구현을 통해 수작업 대비 처리 시간을 80% 단축시키고, 클라우드 비용 이상 탐지 프로젝트에서는 LangGraph 기반 에이전트 파이프라인 설계를 적용하여 실시간 과금 패턴 분석을 수행했습니다. [출처: 2024_프로젝트_이력.docx, 기술스택_정리본.docx]</w:t>
+        <w:rPr>
+          <w:rFonts w:ascii="맑은 고딕" w:hAnsi="맑은 고딕" w:eastAsia="맑은 고딕"/>
+          <w:color w:val="3C3C3C"/>
+          <w:sz w:val="22"/>
+        </w:rPr>
+        <w:t>AI 기반 문서 자동화는 다양한 템플릿을 활용하여 효율적으로 문서를 생성하고 처리 시간을 줄이는 기술입니다. 주요 특징으로는 수작업 대비 처리 시간 단축, 고정 템플릿 사용 등이 있습니다. 이 기술은 AWS Bedrock Agent를 활용한 통관 서류 자동 생성 시스템 구축 등 다양한 응용 프로그램을 제공합니다.</w:t>
+      </w:r>
+    </w:p>
+    <w:p>
+      <w:pPr>
+        <w:spacing w:before="160"/>
+      </w:pPr>
+      <w:r>
+        <w:rPr>
+          <w:rFonts w:ascii="맑은 고딕" w:hAnsi="맑은 고딕" w:eastAsia="맑은 고딕"/>
+          <w:color w:val="20AEE5"/>
+          <w:sz w:val="18"/>
+        </w:rPr>
+        <w:t>[출처: 2024_프로젝트_이력.docx, 기술스택_정리본.docx]</w:t>
       </w:r>
     </w:p>
     <w:p>
       <w:r>
         <w:rPr>
+          <w:rFonts w:ascii="맑은 고딕" w:hAnsi="맑은 고딕" w:eastAsia="맑은 고딕"/>
+          <w:color w:val="6C6C6C"/>
           <w:sz w:val="18"/>
         </w:rPr>
         <w:t>참고문서:</w:t>
@@ -53,19 +122,90 @@
     <w:p>
       <w:pPr>
         <w:pStyle w:val="Heading2"/>
+        <w:spacing w:before="360" w:after="160"/>
       </w:pPr>
       <w:r>
-        <w:t>차별화 전략</w:t>
+        <w:rPr>
+          <w:rFonts w:ascii="맑은 고딕" w:hAnsi="맑은 고딕" w:eastAsia="맑은 고딕"/>
+          <w:b/>
+          <w:color w:val="003899"/>
+          <w:sz w:val="32"/>
+        </w:rPr>
+        <w:t>현황 분석</w:t>
       </w:r>
     </w:p>
     <w:p>
+      <w:pPr>
+        <w:spacing w:line="360" w:lineRule="auto" w:after="160"/>
+      </w:pPr>
       <w:r>
-        <w:t>회사의 차별화 전략과 경쟁 우위를 설명하면, 다음과 같습니다. 첫째, 회사는 AWS Bedrock Agent 기반 통관 서류 자동 생성 시스템을 구축하여 수작업 대비 처리 시간을 80% 단축하였습니다 (2024_프로젝트_이력.docx). 둘째, LangGraph 기반 에이전트 파이프라인과 Isolation Forest, Z-score 알고리즘 등을 활용해 클라우드 비용 이상탐지를 실시간으로 향상시켰습니다 (2024_프로젝트_이력.docx). 이러한 차별화된 솔루션은 회사가 효율성과 안정성을 높이는 동시에 경쟁 우위를 확보하는 핵심 요소가 됩니다. [출처: 2024_프로젝트_이력.docx, 기술스택_정리본.docx]</w:t>
+        <w:rPr>
+          <w:rFonts w:ascii="맑은 고딕" w:hAnsi="맑은 고딕" w:eastAsia="맑은 고딕"/>
+          <w:color w:val="3C3C3C"/>
+          <w:sz w:val="22"/>
+        </w:rPr>
+        <w:t>현재 AI 기반 문서 자동화 시장에서는 금융과 제조 업계가 주도적 역할을 하고 있습니다. 국내 기업들은 RAG(Relevant Abstract Generation) 기술을 활용한 보고서 생성 시스템 구축에 적극적으로 나서고 있으며, 그리드원은 GO;DO 플랫폼을 통해 AI Agent, RPA, RAG 기능을 통합하여 업무 자동화 시장에서 경쟁하고 있습니다. 글로벌 시장에서도 금융 서비스와 제조업계가 빠른 속도로 LLM( Large Language Model)-기반 문서 자동화 솔루션을 도입하고 있으며, SaaS 회사들은 실시간 문서 통합 기능을 강화하고 있습니다.</w:t>
+      </w:r>
+    </w:p>
+    <w:p>
+      <w:pPr>
+        <w:spacing w:before="160"/>
+      </w:pPr>
+      <w:r>
+        <w:rPr>
+          <w:rFonts w:ascii="맑은 고딕" w:hAnsi="맑은 고딕" w:eastAsia="맑은 고딕"/>
+          <w:color w:val="20AEE5"/>
+          <w:sz w:val="18"/>
+        </w:rPr>
+        <w:t>[출처: [국내] 국내 기업 RAG 도입 현황 - AI타임스 (https://mock-news.example.com/korea-rag-adoption), [국내] 그리드원, 엔터프라이즈 AI 플랫폼 전략 발표 (https://mock-news.example.com/gridone-platform), [글로벌] Enterprise RAG Market Trends 2024 - TechInsights (https://mock-news.example.com/rag-market-trend-2024), [글로벌] SaaS Document Integration - TechNews (https://mock-news.example.com/saas-document-sync)]</w:t>
+      </w:r>
+    </w:p>
+    <w:p>
+      <w:pPr>
+        <w:pStyle w:val="Heading2"/>
+        <w:spacing w:before="360" w:after="160"/>
+      </w:pPr>
+      <w:r>
+        <w:rPr>
+          <w:rFonts w:ascii="맑은 고딕" w:hAnsi="맑은 고딕" w:eastAsia="맑은 고딕"/>
+          <w:b/>
+          <w:color w:val="003899"/>
+          <w:sz w:val="32"/>
+        </w:rPr>
+        <w:t>기술적 내용</w:t>
+      </w:r>
+    </w:p>
+    <w:p>
+      <w:pPr>
+        <w:spacing w:line="360" w:lineRule="auto" w:after="160"/>
+      </w:pPr>
+      <w:r>
+        <w:rPr>
+          <w:rFonts w:ascii="맑은 고딕" w:hAnsi="맑은 고딕" w:eastAsia="맑은 고딕"/>
+          <w:color w:val="3C3C3C"/>
+          <w:sz w:val="22"/>
+        </w:rPr>
+        <w:t>AI 기술은 문서 자동화에 다양한 방법으로 활용될 수 있습니다. 특히, AWS Bedrock Agent 기반 템플릿 필러 구현을 통한 Python-docx 라이브러리 사용을 통해, 수작업 대비 처리 시간을 80% 단축할 수 있는 시스템을 구축하는 것이 가능합니다.</w:t>
+      </w:r>
+    </w:p>
+    <w:p>
+      <w:pPr>
+        <w:spacing w:before="160"/>
+      </w:pPr>
+      <w:r>
+        <w:rPr>
+          <w:rFonts w:ascii="맑은 고딕" w:hAnsi="맑은 고딕" w:eastAsia="맑은 고딕"/>
+          <w:color w:val="20AEE5"/>
+          <w:sz w:val="18"/>
+        </w:rPr>
+        <w:t>[출처: 2024_프로젝트_이력.docx, 기술스택_정리본.docx]</w:t>
       </w:r>
     </w:p>
     <w:p>
       <w:r>
         <w:rPr>
+          <w:rFonts w:ascii="맑은 고딕" w:hAnsi="맑은 고딕" w:eastAsia="맑은 고딕"/>
+          <w:color w:val="6C6C6C"/>
           <w:sz w:val="18"/>
         </w:rPr>
         <w:t>참고문서:</w:t>
@@ -80,14 +220,94 @@
     <w:p>
       <w:pPr>
         <w:pStyle w:val="Heading2"/>
+        <w:spacing w:before="360" w:after="160"/>
       </w:pPr>
       <w:r>
-        <w:t>시장 동향</w:t>
+        <w:rPr>
+          <w:rFonts w:ascii="맑은 고딕" w:hAnsi="맑은 고딕" w:eastAsia="맑은 고딕"/>
+          <w:b/>
+          <w:color w:val="003899"/>
+          <w:sz w:val="32"/>
+        </w:rPr>
+        <w:t>전략 및 도전 과제</w:t>
       </w:r>
     </w:p>
     <w:p>
+      <w:pPr>
+        <w:spacing w:before="160" w:after="160"/>
+        <w:ind w:left="288" w:right="288"/>
+        <w:shd w:val="clear" w:color="auto" w:fill="FFF3CD"/>
+        <w:pBdr>
+          <w:top w:val="single" w:sz="6" w:space="4" w:color="E0A800"/>
+          <w:left w:val="single" w:sz="6" w:space="4" w:color="E0A800"/>
+          <w:bottom w:val="single" w:sz="6" w:space="4" w:color="E0A800"/>
+          <w:right w:val="single" w:sz="6" w:space="4" w:color="E0A800"/>
+        </w:pBdr>
+      </w:pPr>
       <w:r>
-        <w:t>RAG 기반 문서 자동화 시장은 급성장하고 있으며, 2024년에는 전년 대비 2배 이상 성장할 것으로 예상됩니다. 특히 금융·물류·제조 업계에서 LLM과 사내 문서를 연동한 자동 리포트 생성 솔루션의 도입이 확산되고 있습니다. 또한, 주요 SaaS 기업들은 실시간 문서 연동 기능을 고도화하는 경쟁이 심화되고 있으며, RAG 기반 문서 자동화 시장에서도 '환각(hallucination) 방지'가 중요한 과제로 꼽히고 있습니다. [출처: RAG 문서 자동화 시장 동향 - AI타임스 (https://mock-news.example.com/rag-market-trend-2024), SaaS 문서 연동 경쟁 심화 - 테크뉴스 (https://mock-news.example.com/saas-document-sync-competition), RAG 환각 방지 전략 - AI인사이트 (https://mock-news.example.com/rag-hallucination-prevention)]</w:t>
+        <w:rPr>
+          <w:rFonts w:ascii="맑은 고딕" w:hAnsi="맑은 고딕" w:eastAsia="맑은 고딕"/>
+          <w:b/>
+          <w:color w:val="856D04"/>
+          <w:sz w:val="20"/>
+        </w:rPr>
+        <w:t xml:space="preserve">  검토 필요  |  근거 부족 또는 신뢰도 낮음</w:t>
+      </w:r>
+    </w:p>
+    <w:p>
+      <w:pPr>
+        <w:spacing w:before="240" w:after="80"/>
+      </w:pPr>
+      <w:r>
+        <w:rPr>
+          <w:rFonts w:ascii="맑은 고딕" w:hAnsi="맑은 고딕" w:eastAsia="맑은 고딕"/>
+          <w:b/>
+          <w:color w:val="6C6C6C"/>
+          <w:sz w:val="18"/>
+        </w:rPr>
+        <w:t>참고용 초안</w:t>
+      </w:r>
+    </w:p>
+    <w:p>
+      <w:pPr>
+        <w:spacing w:line="360" w:lineRule="auto" w:after="160"/>
+      </w:pPr>
+      <w:r>
+        <w:rPr>
+          <w:rFonts w:ascii="맑은 고딕" w:hAnsi="맑은 고딕" w:eastAsia="맑은 고딕"/>
+          <w:i/>
+          <w:color w:val="3C3C3C"/>
+          <w:sz w:val="22"/>
+        </w:rPr>
+        <w:t>향후 AI 기반 문서 자동화의 전략적 접근은 주로 클라우드 기반 솔루션을 활용하여 효율적인 자동 생성 시스템 구축에 중점을 둡니다. 특히 AWS Bedrock Agent와 python-docx 라이브러리를 사용한 템플릿 필러 구현으로 수작업 대비 처리 시간을 80% 단축하는 등의 효과를 기대할 수 있습니다. 그러나 이를 위해서는 AI 알고리즘의 정확성과 효율성을 확보해야 하며, 비정상 패턴이나 이상 탐지 등 실시간으로 문제점을 감지하고 수정하기 위한 자동화 시스템 구축이 필요합니다.</w:t>
+      </w:r>
+    </w:p>
+    <w:p>
+      <w:pPr>
+        <w:pStyle w:val="Heading2"/>
+        <w:spacing w:before="360" w:after="160"/>
+      </w:pPr>
+      <w:r>
+        <w:rPr>
+          <w:rFonts w:ascii="맑은 고딕" w:hAnsi="맑은 고딕" w:eastAsia="맑은 고딕"/>
+          <w:b/>
+          <w:color w:val="003899"/>
+          <w:sz w:val="32"/>
+        </w:rPr>
+        <w:t>결론</w:t>
+      </w:r>
+    </w:p>
+    <w:p>
+      <w:pPr>
+        <w:spacing w:line="360" w:lineRule="auto" w:after="160"/>
+      </w:pPr>
+      <w:r>
+        <w:rPr>
+          <w:rFonts w:ascii="맑은 고딕" w:hAnsi="맑은 고딕" w:eastAsia="맑은 고딕"/>
+          <w:color w:val="3C3C3C"/>
+          <w:sz w:val="22"/>
+        </w:rPr>
+        <w:t>본 보고서에서는 현대 사회에서 디지털 기술의 중요성과 그것이 우리 생활에 미치는 영향을 조명하였습니다. 다양한 분야에서 디지털 혁신은 생산성 향상, 효율적인 의사소통 및 정보 접근성을 높이는 등 많은 이점을 제공하고 있습니다. 그러나 동시에 개인의 사생활 침해와 데이터 보안 문제 등을 포함한 여러 도전 과제도 함께 제기되었습니다. 이러한 점을 고려할 때, 디지털 기술은 계속해서 발전하며 그 적용 범위를 넓혀나가야 하며, 이에 따른 책임감 있는 규제와 사용자 보호 정책이 필요합니다. 따라서 저희는 지속적인 연구와 개발을 통해 디지털 혁신의 긍정적 측면을 극대화하고 부작용을 최소화하기를 추천드립니다.</w:t>
       </w:r>
     </w:p>
     <w:sectPr>
@@ -463,6 +683,14 @@
     <w:name w:val="Normal"/>
     <w:qFormat/>
     <w:rsid w:val="00FC693F"/>
+    <w:pPr>
+      <w:spacing w:line="360" w:lineRule="auto"/>
+    </w:pPr>
+    <w:rPr>
+      <w:rFonts w:ascii="맑은 고딕" w:hAnsi="맑은 고딕" w:eastAsia="맑은 고딕"/>
+      <w:color w:val="3C3C3C"/>
+      <w:sz w:val="22"/>
+    </w:rPr>
   </w:style>
   <w:style w:type="paragraph" w:styleId="Header">
     <w:name w:val="header"/>
@@ -523,11 +751,11 @@
       <w:outlineLvl w:val="0"/>
     </w:pPr>
     <w:rPr>
-      <w:rFonts w:asciiTheme="majorHAnsi" w:eastAsiaTheme="majorEastAsia" w:hAnsiTheme="majorHAnsi" w:cstheme="majorBidi"/>
+      <w:rFonts w:asciiTheme="majorHAnsi" w:eastAsiaTheme="majorEastAsia" w:hAnsiTheme="majorHAnsi" w:cstheme="majorBidi" w:ascii="맑은 고딕" w:hAnsi="맑은 고딕" w:eastAsia="맑은 고딕"/>
       <w:b/>
       <w:bCs/>
-      <w:color w:val="365F91" w:themeColor="accent1" w:themeShade="BF"/>
-      <w:sz w:val="28"/>
+      <w:color w:val="0C1331"/>
+      <w:sz w:val="48"/>
       <w:szCs w:val="28"/>
     </w:rPr>
   </w:style>
@@ -547,11 +775,11 @@
       <w:outlineLvl w:val="1"/>
     </w:pPr>
     <w:rPr>
-      <w:rFonts w:asciiTheme="majorHAnsi" w:eastAsiaTheme="majorEastAsia" w:hAnsiTheme="majorHAnsi" w:cstheme="majorBidi"/>
+      <w:rFonts w:asciiTheme="majorHAnsi" w:eastAsiaTheme="majorEastAsia" w:hAnsiTheme="majorHAnsi" w:cstheme="majorBidi" w:ascii="맑은 고딕" w:hAnsi="맑은 고딕" w:eastAsia="맑은 고딕"/>
       <w:b/>
       <w:bCs/>
-      <w:color w:val="4F81BD" w:themeColor="accent1"/>
-      <w:sz w:val="26"/>
+      <w:color w:val="003899"/>
+      <w:sz w:val="32"/>
       <w:szCs w:val="26"/>
     </w:rPr>
   </w:style>
@@ -571,10 +799,11 @@
       <w:outlineLvl w:val="2"/>
     </w:pPr>
     <w:rPr>
-      <w:rFonts w:asciiTheme="majorHAnsi" w:eastAsiaTheme="majorEastAsia" w:hAnsiTheme="majorHAnsi" w:cstheme="majorBidi"/>
+      <w:rFonts w:asciiTheme="majorHAnsi" w:eastAsiaTheme="majorEastAsia" w:hAnsiTheme="majorHAnsi" w:cstheme="majorBidi" w:ascii="맑은 고딕" w:hAnsi="맑은 고딕" w:eastAsia="맑은 고딕"/>
       <w:b/>
       <w:bCs/>
-      <w:color w:val="4F81BD" w:themeColor="accent1"/>
+      <w:color w:val="003899"/>
+      <w:sz w:val="26"/>
     </w:rPr>
   </w:style>
   <w:style w:type="paragraph" w:styleId="Heading4">

</xml_diff>